<commit_message>
Format bibliography to have hanging indent
</commit_message>
<xml_diff>
--- a/template.docx
+++ b/template.docx
@@ -1254,6 +1254,11 @@
     <w:name w:val="Bibliography"/>
     <w:basedOn w:val="Normal"/>
     <w:qFormat/>
+    <w:rsid w:val="003739C7"/>
+    <w:pPr>
+      <w:ind w:left="720" w:hanging="720"/>
+      <w:contextualSpacing/>
+    </w:pPr>
   </w:style>
   <w:style w:type="character" w:customStyle="1" w:styleId="Heading1Char">
     <w:name w:val="Heading 1 Char"/>

</xml_diff>